<commit_message>
Paula Fernandes: Parte 1 sem citações diretas
Co-Authored-By: Claude Opus 5.5 <noreply@anthropic.com>
Claude-Session: https://claude.ai/code/session_01MJjUEEZrxQDEUifKK2vj9g
</commit_message>
<xml_diff>
--- a/roteiros/paula-fernandes/Paula_Parte1.docx
+++ b/roteiros/paula-fernandes/Paula_Parte1.docx
@@ -71,7 +71,7 @@
         <w:rPr>
           <w:color w:val="000000"/>
         </w:rPr>
-        <w:t>Muitos anos depois, já famosa, ela descreveu a menina que foi naquela época com uma frase que ninguém esperava ouvir da cantora dos vestidos longos e do cabelo impecável.</w:t>
+        <w:t>Quem vê hoje a cantora dos vestidos longos e do cabelo impecável não imagina como era aquela menina.</w:t>
       </w:r>
     </w:p>
     <w:p>
@@ -79,7 +79,7 @@
         <w:rPr>
           <w:color w:val="000000"/>
         </w:rPr>
-        <w:t>"Eu era um menino: de botina, de calça jeans, paupérrima."</w:t>
+        <w:t>Ela andava de botina e calça jeans, como um menino da roça. A família era muito pobre.</w:t>
       </w:r>
     </w:p>
     <w:p>
@@ -87,23 +87,7 @@
         <w:rPr>
           <w:color w:val="000000"/>
         </w:rPr>
-        <w:t>Paupérrima.</w:t>
-      </w:r>
-    </w:p>
-    <w:p>
-      <w:r>
-        <w:rPr>
-          <w:color w:val="000000"/>
-        </w:rPr>
-        <w:t>Segundo ela, a casa da família não tinha luz elétrica e não tinha banheiro. A comida vinha da própria terra.</w:t>
-      </w:r>
-    </w:p>
-    <w:p>
-      <w:r>
-        <w:rPr>
-          <w:color w:val="000000"/>
-        </w:rPr>
-        <w:t>"A gente produzia o que a gente comia e ia para a cidade para comprar arroz e sal."</w:t>
+        <w:t>A casa não tinha luz elétrica e não tinha banheiro. Quase tudo o que eles comiam saía da própria terra. Só iam até a cidade para comprar o que não dava para plantar, como o arroz e o sal.</w:t>
       </w:r>
     </w:p>
     <w:p>
@@ -223,15 +207,7 @@
         <w:rPr>
           <w:color w:val="000000"/>
         </w:rPr>
-        <w:t>Ela mesma conta como foi.</w:t>
-      </w:r>
-    </w:p>
-    <w:p>
-      <w:r>
-        <w:rPr>
-          <w:color w:val="000000"/>
-        </w:rPr>
-        <w:t>"Eu saí de casa com onze anos e fui para São Paulo."</w:t>
+        <w:t>Com apenas onze anos, Paula saiu de casa e foi para São Paulo.</w:t>
       </w:r>
     </w:p>
     <w:p>
@@ -295,7 +271,15 @@
         <w:rPr>
           <w:color w:val="000000"/>
         </w:rPr>
-        <w:t>Ela tinha um nome para esse papel.</w:t>
+        <w:t>Paula se sentia como uma caixa de som. Uma voz de fundo, que enchia o silêncio enquanto todo mundo olhava para outro lugar.</w:t>
+      </w:r>
+    </w:p>
+    <w:p>
+      <w:r>
+        <w:rPr>
+          <w:color w:val="C00000"/>
+        </w:rPr>
+        <w:t>Naquela época, Paula fazia uma pergunta à mãe que mostra exatamente o tamanho do medo que ela carregava. E a resposta de dona Dulce, dada quando ninguém mais acreditava, só ia fazer sentido muitos anos depois.</w:t>
       </w:r>
     </w:p>
     <w:p>
@@ -303,15 +287,7 @@
         <w:rPr>
           <w:color w:val="000000"/>
         </w:rPr>
-        <w:t>Caixa de som.</w:t>
-      </w:r>
-    </w:p>
-    <w:p>
-      <w:r>
-        <w:rPr>
-          <w:color w:val="C00000"/>
-        </w:rPr>
-        <w:t>Anos depois, Paula fez uma pergunta à mãe que mostra exatamente como ela se sentia naquela época. E a resposta de dona Dulce, dada quando ninguém mais acreditava, só ia fazer sentido muitos anos depois.</w:t>
+        <w:t>Paula voltava para casa cansada e perguntava se um dia ia acontecer alguma coisa para ela. Ou se ia passar a vida inteira sendo só uma caixa de som, cantando para gente que não estava ouvindo.</w:t>
       </w:r>
     </w:p>
     <w:p>
@@ -319,31 +295,7 @@
         <w:rPr>
           <w:color w:val="000000"/>
         </w:rPr>
-        <w:t>A pergunta era esta.</w:t>
-      </w:r>
-    </w:p>
-    <w:p>
-      <w:r>
-        <w:rPr>
-          <w:color w:val="000000"/>
-        </w:rPr>
-        <w:t>"Mãe, será que vai acontecer algum dia para mim ou eu vou ser caixa de som a vida inteira?"</w:t>
-      </w:r>
-    </w:p>
-    <w:p>
-      <w:r>
-        <w:rPr>
-          <w:color w:val="000000"/>
-        </w:rPr>
-        <w:t>Ser caixa de som. Cantar a vida inteira para gente que não estava ouvindo, enquanto o sonho de verdade nunca chegava.</w:t>
-      </w:r>
-    </w:p>
-    <w:p>
-      <w:r>
-        <w:rPr>
-          <w:color w:val="000000"/>
-        </w:rPr>
-        <w:t>Ela fazia essa pergunta e a mãe dava sempre a mesma resposta. Uma resposta que a gente vai ouvir mais para frente nessa história.</w:t>
+        <w:t>A mãe ouvia aquela pergunta e respondia sempre a mesma coisa. Uma resposta que você vai conhecer mais para frente nessa história.</w:t>
       </w:r>
     </w:p>
     <w:p>
@@ -423,15 +375,7 @@
         <w:rPr>
           <w:color w:val="C00000"/>
         </w:rPr>
-        <w:t>Foi aí que tudo começou a desabar. Porque, quando estava quase completando dezoito anos, Paula chegou ao limite. Ela mesma resume aquele momento em três palavras. E o que veio depois disso ela guardou longe do público durante muitos anos.</w:t>
-      </w:r>
-    </w:p>
-    <w:p>
-      <w:r>
-        <w:rPr>
-          <w:color w:val="000000"/>
-        </w:rPr>
-        <w:t>"Foi um basta."</w:t>
+        <w:t>Foi aí que tudo começou a desabar. Porque, quando estava quase completando dezoito anos, Paula chegou ao limite. Ela não aguentava mais. E o que veio depois disso ela guardou longe do público durante muitos anos.</w:t>
       </w:r>
     </w:p>
     <w:sectPr>

</xml_diff>

<commit_message>
Paula Fernandes: revisão da Parte 1
Co-Authored-By: Claude Opus 5.5 <noreply@anthropic.com>
Claude-Session: https://claude.ai/code/session_01MJjUEEZrxQDEUifKK2vj9g
</commit_message>
<xml_diff>
--- a/roteiros/paula-fernandes/Paula_Parte1.docx
+++ b/roteiros/paula-fernandes/Paula_Parte1.docx
@@ -111,7 +111,7 @@
         <w:rPr>
           <w:color w:val="000000"/>
         </w:rPr>
-        <w:t>Na casa sem luz, havia uma pessoa que nunca deixou faltar nada.</w:t>
+        <w:t>Na casa sem luz, havia uma pessoa que segurava tudo.</w:t>
       </w:r>
     </w:p>
     <w:p>
@@ -127,7 +127,7 @@
         <w:rPr>
           <w:color w:val="000000"/>
         </w:rPr>
-        <w:t>Foi dona Dulce quem segurou a família nos anos mais difíceis. E foi ela quem percebeu, antes de qualquer outra pessoa, que aquela menina de botina tinha uma coisa diferente na voz.</w:t>
+        <w:t>Se a família atravessou aqueles anos sem passar fome, foi por causa de dona Dulce. E era ela quem mais acreditava na voz daquela menina de botina.</w:t>
       </w:r>
     </w:p>
     <w:p>
@@ -143,7 +143,7 @@
         <w:rPr>
           <w:color w:val="000000"/>
         </w:rPr>
-        <w:t>Cantava na roça e em qualquer festa onde deixassem uma menina subir num banquinho para soltar a voz.</w:t>
+        <w:t>Cantava em casa, na roça, nas festas da região. Onde houvesse alguém para ouvir, ela cantava.</w:t>
       </w:r>
     </w:p>
     <w:p>
@@ -247,7 +247,7 @@
         <w:rPr>
           <w:color w:val="000000"/>
         </w:rPr>
-        <w:t>Enquanto outras crianças da idade dela estavam na escola ou brincando na rua, Paula passava as noites em cima de palcos montados em cidades do interior que ela nunca tinha visto antes.</w:t>
+        <w:t>Enquanto outras crianças da idade dela passavam o fim de semana brincando na rua, Paula passava as noites em cima de palcos montados em cidades do interior que ela nunca tinha visto antes.</w:t>
       </w:r>
     </w:p>
     <w:p>
@@ -327,6 +327,14 @@
         <w:rPr>
           <w:color w:val="000000"/>
         </w:rPr>
+        <w:t>Esse dia não chegava.</w:t>
+      </w:r>
+    </w:p>
+    <w:p>
+      <w:r>
+        <w:rPr>
+          <w:color w:val="000000"/>
+        </w:rPr>
         <w:t>Pense no que essa menina perdeu pelo caminho. As festas de quinze anos das amigas. O primeiro namoro na pracinha da cidade. As tardes comuns de quem cresce no mesmo lugar.</w:t>
       </w:r>
     </w:p>
@@ -335,15 +343,7 @@
         <w:rPr>
           <w:color w:val="000000"/>
         </w:rPr>
-        <w:t>Tudo isso ficou para trás, em troca de uma promessa que ninguém tinha feito a ela.</w:t>
-      </w:r>
-    </w:p>
-    <w:p>
-      <w:r>
-        <w:rPr>
-          <w:color w:val="000000"/>
-        </w:rPr>
-        <w:t>Esse dia não chegava.</w:t>
+        <w:t>Tudo isso ficou para trás, em troca de um sonho que ainda não tinha dado em nada.</w:t>
       </w:r>
     </w:p>
     <w:p>
@@ -375,7 +375,7 @@
         <w:rPr>
           <w:color w:val="C00000"/>
         </w:rPr>
-        <w:t>Foi aí que tudo começou a desabar. Porque, quando estava quase completando dezoito anos, Paula chegou ao limite. Ela não aguentava mais. E o que veio depois disso ela guardou longe do público durante muitos anos.</w:t>
+        <w:t>Foi aí que tudo começou a desabar. Porque, quando estava quase completando dezoito anos, Paula chegou ao limite. E foi numa dessas noites que ela tomou a decisão mais sombria da própria vida. Uma decisão que ela guardou longe do público durante muitos anos.</w:t>
       </w:r>
     </w:p>
     <w:sectPr>

</xml_diff>